<commit_message>
Fassung 0.4.0: Unterlagen, Checkpoint, Aenderungsverlauf
Der Stand ist damit belegt statt behauptet: der Windows-Ablauf bezieht ein
echtes Modell, startet den mitgelieferten Dienst und laesst eine Fachfrage
beantworten - alle 22 Schritte bestanden (Lauf 34033752742).

* PROJEKTSTATUS: Task 32 "Sprachmodell laeuft"; in der Liste dessen, was
  NICHT geprueft ist, faellt "Lokales Sprachmodell" heraus und wird durch
  die zwei ehrlichen Nachfolger ersetzt - die fachliche Guete der Antworten
  (haengt vom Modell ab) und Plugins fremder Herkunft (keine Beschraenkung
  durch das Betriebssystem).
* TESTBERICHT: 484 Tests, die neuen Dateien mit ihren Zahlen.
* CHANGELOG: Fassung 0.4.0.
* WEITERARBEIT: Abnahmepunkt C ist erledigt.
* Checkpoint 27 an beiden Orten.

Co-Authored-By: Claude Opus 5 <noreply@anthropic.com>
Claude-Session: https://claude.ai/code/session_01F5qyXDsQHGYr69U9C8fQcZ
</commit_message>
<xml_diff>
--- a/docs/BEDIENUNGSANLEITUNG.docx
+++ b/docs/BEDIENUNGSANLEITUNG.docx
@@ -37,7 +37,7 @@
           <w:color w:val="555555"/>
           <w:sz w:val="20"/>
         </w:rPr>
-        <w:t>Programmfassung 0.3.0  ·  Fachmodul 0.1.0  ·  Stand 06.09.2026</w:t>
+        <w:t>Programmfassung 0.4.0  ·  Fachmodul 0.1.0  ·  Stand 06.09.2026</w:t>
       </w:r>
     </w:p>
     <w:p/>
@@ -11080,7 +11080,7 @@
           <w:color w:val="555555"/>
           <w:sz w:val="18"/>
         </w:rPr>
-        <w:t>Diese Anleitung beschreibt Programmfassung 0.3.0 mit dem Fachmodul Portabler KI-Buchhalter 0.1.0. Aendert sich die Oberflaeche, aendert sich auch dieses Dokument.</w:t>
+        <w:t>Diese Anleitung beschreibt Programmfassung 0.4.0 mit dem Fachmodul Portabler KI-Buchhalter 0.1.0. Aendert sich die Oberflaeche, aendert sich auch dieses Dokument.</w:t>
       </w:r>
     </w:p>
     <w:sectPr>

</xml_diff>